<commit_message>
docs: regenerate API key guides with web research
Research stage used live web sources for up-to-date setup instructions.

Co-Authored-By: Claude Opus 4.6 <noreply@anthropic.com>
</commit_message>
<xml_diff>
--- a/docs/guides/Gemini_API-Key_erstellen_-_Schritt-fuer-Schritt-Anleitung.docx
+++ b/docs/guides/Gemini_API-Key_erstellen_-_Schritt-fuer-Schritt-Anleitung.docx
@@ -27,7 +27,7 @@
     </w:p>
     <w:p>
       <w:r>
-        <w:t>Die Gemini API ist ein Teil von Google AI Studio, einer Plattform für künstliche Intelligenz und maschinelles Lernen. Der Zweck dieser Anleitung ist es, Schritt-für-Schritt-Anleitungen zur Erstellung eines Gemini API-Keys zu geben. Google AI Studio bietet eine Vielzahl von Tools und Diensten für die Entwicklung von KI-Anwendungen. Durch diese Anleitung sollen Entwickler in der Lage sein, einen API-Key zu erstellen und ihn für die Entwicklung von KI-Anwendungen zu verwenden.</w:t>
+        <w:t>Die Gemini API ist eine Schnittstelle, die es ermöglicht, auf die Funktionen von Google AI Studio zuzugreifen. Um die Gemini API zu nutzen, benötigt man einen API-Key, der im Google AI Studio erstellt werden kann. Diese Anleitung soll Schritt-für-Schritt erklären, wie man einen API-Key im Google AI Studio erstellt. Der API-Key ist wichtig, um sicherzustellen, dass nur autorisierte Anwendungen auf die Funktionen von Google AI Studio zugreifen können.</w:t>
       </w:r>
     </w:p>
     <w:p>
@@ -40,7 +40,7 @@
           <w:color w:val="888888"/>
           <w:sz w:val="20"/>
         </w:rPr>
-        <w:t>[Icon]  [Das Google AI Studio-Logo anzeigen]</w:t>
+        <w:t>[Icon]  [Darstellung des API-Keys als Schlüssel]</w:t>
       </w:r>
     </w:p>
     <w:p>
@@ -56,7 +56,7 @@
     </w:p>
     <w:p>
       <w:r>
-        <w:t>Um auf Google AI Studio zuzugreifen, muss man die Website aistudio.google.com besuchen. Der Zugriff auf Google AI Studio erfordert in der Regel eine Internetverbindung und einen Webbrowser. Google AI Studio bietet eine Benutzeroberfläche, die es Benutzern ermöglicht, ihre KI-Anwendungen zu entwickeln und zu verwalten.</w:t>
+        <w:t>Der erste Schritt ist, die Google AI Studio Webseite aufzurufen, die unter aistudio.google.com/apikey erreichbar ist. Um auf die Google AI Studio Webseite zuzugreifen, muss man sich mit einem Google-Account anmelden. Die Anmeldung erfolgt über den Button 'Anmelden' auf der Startseite von Google AI Studio.</w:t>
       </w:r>
     </w:p>
     <w:p>
@@ -69,7 +69,7 @@
           <w:color w:val="888888"/>
           <w:sz w:val="20"/>
         </w:rPr>
-        <w:t>[Screenshot]  [Die Google AI Studio-Website anzeigen]</w:t>
+        <w:t>[Screenshot]  [Darstellung der Google AI Studio Startseite]</w:t>
       </w:r>
     </w:p>
     <w:p>
@@ -85,7 +85,7 @@
     </w:p>
     <w:p>
       <w:r>
-        <w:t>Um sich bei Google AI Studio anzumelden, benötigt man ein Google-Konto. Die Anmeldung bei Google AI Studio erfolgt über die Google-Konto-Anmeldung, die auch für andere Google-Dienste verwendet wird. Nach der Anmeldung kann man auf die Funktionen und Dienste von Google AI Studio zugreifen.</w:t>
+        <w:t>Um sich mit einem Google-Account anzumelden, muss man seine E-Mail-Adresse und sein Passwort eingeben. Wenn man noch keinen Google-Account hat, kann man sich unter google.com/accounts registrieren. Nach der Anmeldung wird man auf die Startseite von Google AI Studio weitergeleitet.</w:t>
       </w:r>
     </w:p>
     <w:p>
@@ -98,7 +98,7 @@
           <w:color w:val="888888"/>
           <w:sz w:val="20"/>
         </w:rPr>
-        <w:t>[Screenshot]  [Die Google-Konto-Anmeldeseite anzeigen]</w:t>
+        <w:t>[Screenshot]  [Darstellung der Anmeldemaske]</w:t>
       </w:r>
     </w:p>
     <w:p>
@@ -114,7 +114,7 @@
     </w:p>
     <w:p>
       <w:r>
-        <w:t>Der API-Key ist ein wichtiger Teil der Authentifizierung bei Google AI Studio und muss sorgfältig erstellt und gespeichert werden. Um einen API-Key zu erstellen, muss man im Google AI Studio auf die entsprechende Option klicken und die Anweisungen befolgen. Der erstellte API-Key sollte sicher gespeichert werden, um Missbrauch zu vermeiden.</w:t>
+        <w:t>Um einen API-Key im Google AI Studio zu erstellen, muss man auf den Button 'API-Keys' klicken. Dann muss man auf 'Neuen API-Key erstellen' klicken und einen Namen für den API-Key eingeben. Nach der Erstellung des API-Keys wird er auf der Seite 'API-Keys' angezeigt.</w:t>
       </w:r>
     </w:p>
     <w:p>
@@ -127,7 +127,7 @@
           <w:color w:val="888888"/>
           <w:sz w:val="20"/>
         </w:rPr>
-        <w:t>[Diagramm]  [Den Prozess der API-Key-Erstellung anzeigen]</w:t>
+        <w:t>[Screenshot]  [Darstellung der API-Keys Seite]</w:t>
       </w:r>
     </w:p>
     <w:p>
@@ -143,7 +143,7 @@
     </w:p>
     <w:p>
       <w:r>
-        <w:t>Die .env-Datei ist eine Konfigurationsdatei, die sensible Informationen wie den API-Key speichert. Um den API-Key in die .env-Datei einzutragen, muss man die Datei in einem Texteditor öffnen und den API-Key in das entsprechende Feld eintragen. Die .env-Datei sollte sicher gespeichert werden, um unbefugten Zugriff zu vermeiden.</w:t>
+        <w:t>Der API-Key sollte sicher gespeichert werden, um Missbrauch zu vermeiden. Ein sicherer Weg, den API-Key zu speichern, ist, ihn in einer .env-Datei zu speichern. Die .env-Datei sollte nicht in öffentlich zugängliche Bereiche wie GitHub hochgeladen werden.</w:t>
       </w:r>
     </w:p>
     <w:p>
@@ -156,7 +156,7 @@
           <w:color w:val="888888"/>
           <w:sz w:val="20"/>
         </w:rPr>
-        <w:t>[Screenshot]  [Die .env-Datei in einem Texteditor anzeigen]</w:t>
+        <w:t>[Icon]  [Darstellung der .env-Datei als sicherer Speicher]</w:t>
       </w:r>
     </w:p>
     <w:p>
@@ -167,12 +167,12 @@
         <w:rPr>
           <w:color w:val="1E2761"/>
         </w:rPr>
-        <w:t>Fazit und weitere Schritte</w:t>
+        <w:t>Fazit und Zusammenfassung</w:t>
       </w:r>
     </w:p>
     <w:p>
       <w:r>
-        <w:t>Nachdem der API-Key erstellt und gespeichert wurde, kann man ihn für die Entwicklung von KI-Anwendungen mit Google AI Studio verwenden. Weitere Schritte könnten die Entwicklung von KI-Modellen, die Integration von KI-Funktionen in Anwendungen und die Verwaltung von KI-Ressourcen umfassen. Google AI Studio bietet eine Vielzahl von Ressourcen und Dokumentationen, um Entwicklern bei der Arbeit mit KI-Anwendungen zu helfen.</w:t>
+        <w:t>Zusammenfassung: Um einen API-Key im Google AI Studio zu erstellen, muss man sich anmelden, auf 'API-Keys' klicken und einen neuen API-Key erstellen. Der API-Key sollte sicher gespeichert werden, um Missbrauch zu vermeiden. Durch diese Schritte kann man sicherstellen, dass die Gemini API korrekt verwendet wird.</w:t>
       </w:r>
     </w:p>
     <w:p>
@@ -191,7 +191,7 @@
         <w:pStyle w:val="ListBullet"/>
       </w:pPr>
       <w:r>
-        <w:t>Google AI Studio-Dokumentation</w:t>
+        <w:t>Google AI Studio Dokumentation</w:t>
       </w:r>
     </w:p>
     <w:p>
@@ -199,7 +199,7 @@
         <w:pStyle w:val="ListBullet"/>
       </w:pPr>
       <w:r>
-        <w:t>Google-Konto-Hilfe</w:t>
+        <w:t>Gemini API Dokumentation</w:t>
       </w:r>
     </w:p>
     <w:sectPr>

</xml_diff>